<commit_message>
Work Knowledge - 10/15/2025
</commit_message>
<xml_diff>
--- a/Knowledge/3-Work knowledge/1-Software Engineering/1-Testing/4-Multi Sources/ISTQB_CTFL_Syllabus_v4.0.1/Source.docx
+++ b/Knowledge/3-Work knowledge/1-Software Engineering/1-Testing/4-Multi Sources/ISTQB_CTFL_Syllabus_v4.0.1/Source.docx
@@ -113,6 +113,20 @@
       <w:r>
         <w:t xml:space="preserve"> </w:t>
       </w:r>
+      <w:r>
+        <w:br/>
+        <w:t xml:space="preserve">* </w:t>
+      </w:r>
+      <w:r>
+        <w:rPr>
+          <w:b/>
+          <w:bCs/>
+        </w:rPr>
+        <w:t>Download Server / Mirror:</w:t>
+      </w:r>
+      <w:r>
+        <w:t xml:space="preserve"> tapbackclub-my.sharepoint.com (Microsoft SharePoint Server)</w:t>
+      </w:r>
     </w:p>
     <w:p>
       <w:pPr>
@@ -264,14 +278,7 @@
           <w:b/>
           <w:bCs/>
         </w:rPr>
-        <w:t>Microsoft Teams</w:t>
-      </w:r>
-      <w:r>
-        <w:rPr>
-          <w:b/>
-          <w:bCs/>
-        </w:rPr>
-        <w:t xml:space="preserve"> </w:t>
+        <w:t xml:space="preserve">Microsoft Teams </w:t>
       </w:r>
       <w:r>
         <w:rPr>
@@ -1088,7 +1095,6 @@
   <w:style w:type="character" w:default="1" w:styleId="DefaultParagraphFont">
     <w:name w:val="Default Paragraph Font"/>
     <w:uiPriority w:val="1"/>
-    <w:semiHidden/>
     <w:unhideWhenUsed/>
   </w:style>
   <w:style w:type="table" w:default="1" w:styleId="TableNormal">

</xml_diff>

<commit_message>
Knowledge - 3-Work knowledge - fix sources - 11/7/2025
</commit_message>
<xml_diff>
--- a/Knowledge/3-Work knowledge/1-Software Engineering/1-Testing/4-Multi Sources/ISTQB_CTFL_Syllabus_v4.0.1/Source.docx
+++ b/Knowledge/3-Work knowledge/1-Software Engineering/1-Testing/4-Multi Sources/ISTQB_CTFL_Syllabus_v4.0.1/Source.docx
@@ -24,7 +24,7 @@
         <w:t>[</w:t>
       </w:r>
       <w:r>
-        <w:t>ISTQB_CTFL_Syllabus_v4.0.1</w:t>
+        <w:t>ISTQB_CTFL_Syllabus_v4.0.1.pdf</w:t>
       </w:r>
       <w:r>
         <w:t>]</w:t>
@@ -33,19 +33,7 @@
         <w:t xml:space="preserve"> [</w:t>
       </w:r>
       <w:r>
-        <w:t>ISTQB</w:t>
-      </w:r>
-      <w:r>
-        <w:t xml:space="preserve"> </w:t>
-      </w:r>
-      <w:r>
-        <w:t>CTFL</w:t>
-      </w:r>
-      <w:r>
-        <w:t xml:space="preserve"> </w:t>
-      </w:r>
-      <w:r>
-        <w:t>Syllabus</w:t>
+        <w:t>Multi Sources - ISTQB CTFL Syllabus</w:t>
       </w:r>
       <w:r>
         <w:t>]</w:t>
@@ -80,6 +68,33 @@
       </w:r>
       <w:r>
         <w:t>: Educational</w:t>
+      </w:r>
+      <w:r>
+        <w:br/>
+      </w:r>
+      <w:r>
+        <w:t xml:space="preserve">* </w:t>
+      </w:r>
+      <w:r>
+        <w:rPr>
+          <w:b/>
+          <w:bCs/>
+        </w:rPr>
+        <w:t>Source Platform</w:t>
+      </w:r>
+      <w:r>
+        <w:t xml:space="preserve">: </w:t>
+      </w:r>
+      <w:r>
+        <w:t xml:space="preserve">Microsoft SharePoint – </w:t>
+      </w:r>
+      <w:proofErr w:type="spellStart"/>
+      <w:r>
+        <w:t>TapBack</w:t>
+      </w:r>
+      <w:proofErr w:type="spellEnd"/>
+      <w:r>
+        <w:t xml:space="preserve"> Club (https://tapbackclub-my.sharepoint.com)</w:t>
       </w:r>
     </w:p>
     <w:p>
@@ -125,12 +140,27 @@
         <w:t>Download Server / Mirror:</w:t>
       </w:r>
       <w:r>
-        <w:t xml:space="preserve"> tapbackclub-my.sharepoint.com (Microsoft SharePoint Server)</w:t>
+        <w:t xml:space="preserve"> </w:t>
+      </w:r>
+      <w:r>
+        <w:t xml:space="preserve">https://tapbackclub-my.sharepoint.com [Microsoft SharePoint Online Server – </w:t>
+      </w:r>
+      <w:proofErr w:type="spellStart"/>
+      <w:r>
+        <w:t>TapBack</w:t>
+      </w:r>
+      <w:proofErr w:type="spellEnd"/>
+      <w:r>
+        <w:t xml:space="preserve"> Club Tenant]</w:t>
       </w:r>
     </w:p>
     <w:p>
       <w:pPr>
         <w:pStyle w:val="ListParagraph"/>
+        <w:rPr>
+          <w:b/>
+          <w:bCs/>
+        </w:rPr>
       </w:pPr>
       <w:r>
         <w:t xml:space="preserve">* </w:t>
@@ -146,16 +176,11 @@
         <w:t xml:space="preserve">: </w:t>
       </w:r>
       <w:r>
-        <w:t xml:space="preserve">Download By </w:t>
-      </w:r>
-      <w:r>
-        <w:t>Microsoft Teams</w:t>
-      </w:r>
-    </w:p>
-    <w:p>
-      <w:pPr>
-        <w:pStyle w:val="ListParagraph"/>
-      </w:pPr>
+        <w:t>Application: Microsoft Teams (https://www.microsoft.com/microsoft-teams) [Used to download the shared file directly from a Teams channel / chat linked to SharePoint storage]</w:t>
+      </w:r>
+      <w:r>
+        <w:br/>
+      </w:r>
       <w:r>
         <w:t xml:space="preserve">* </w:t>
       </w:r>
@@ -221,20 +246,35 @@
         <w:t>Saved Location</w:t>
       </w:r>
       <w:r>
-        <w:t>: web75735 \Testing</w:t>
-      </w:r>
-      <w:r>
-        <w:t>\..</w:t>
-      </w:r>
-    </w:p>
-    <w:p>
-      <w:pPr>
-        <w:pStyle w:val="ListParagraph"/>
-        <w:rPr>
-          <w:b/>
-          <w:bCs/>
-        </w:rPr>
-      </w:pPr>
+        <w:t xml:space="preserve">: </w:t>
+      </w:r>
+      <w:proofErr w:type="spellStart"/>
+      <w:r>
+        <w:t>StorageType</w:t>
+      </w:r>
+      <w:proofErr w:type="spellEnd"/>
+      <w:r>
+        <w:t xml:space="preserve">: Cloud -&gt; Platform: GitHub -&gt; Account: </w:t>
+      </w:r>
+      <w:proofErr w:type="spellStart"/>
+      <w:r>
+        <w:t>topicsscience</w:t>
+      </w:r>
+      <w:proofErr w:type="spellEnd"/>
+      <w:r>
+        <w:t xml:space="preserve"> -&gt; Repository: </w:t>
+      </w:r>
+      <w:proofErr w:type="spellStart"/>
+      <w:r>
+        <w:t>kingdomheartsknowledge</w:t>
+      </w:r>
+      <w:proofErr w:type="spellEnd"/>
+      <w:r>
+        <w:t xml:space="preserve"> -&gt; Path: Knowledge/3-Work knowledge/1-Software Engineering/1-Testing/..</w:t>
+      </w:r>
+      <w:r>
+        <w:br/>
+      </w:r>
       <w:r>
         <w:t xml:space="preserve">* </w:t>
       </w:r>
@@ -1095,6 +1135,7 @@
   <w:style w:type="character" w:default="1" w:styleId="DefaultParagraphFont">
     <w:name w:val="Default Paragraph Font"/>
     <w:uiPriority w:val="1"/>
+    <w:semiHidden/>
     <w:unhideWhenUsed/>
   </w:style>
   <w:style w:type="table" w:default="1" w:styleId="TableNormal">

</xml_diff>